<commit_message>
Fix numbering in DOCX and PDF versions
</commit_message>
<xml_diff>
--- a/docs/workflow.docx
+++ b/docs/workflow.docx
@@ -7,6 +7,8 @@
         <w:pStyle w:val="Ttulo"/>
         <w:jc w:val="center"/>
       </w:pPr>
+      <w:bookmarkStart w:id="0" w:name="_GoBack"/>
+      <w:bookmarkEnd w:id="0"/>
       <w:r>
         <w:t>AI-Assisted Software</w:t>
       </w:r>
@@ -3060,15 +3062,7 @@
         <w:pStyle w:val="Listaconvietas"/>
       </w:pPr>
       <w:r>
-        <w:t xml:space="preserve">Apple ecosystems using Terminal, </w:t>
-      </w:r>
-      <w:bookmarkStart w:id="0" w:name="_GoBack"/>
-      <w:r>
-        <w:t xml:space="preserve">Homebrew or Xcode </w:t>
-      </w:r>
-      <w:bookmarkEnd w:id="0"/>
-      <w:r>
-        <w:t>tools</w:t>
+        <w:t>Apple ecosystems using Terminal, Homebrew or Xcode tools</w:t>
       </w:r>
     </w:p>
     <w:p>
@@ -3472,6 +3466,10 @@
     <w:p>
       <w:pPr>
         <w:pStyle w:val="Listaconnmeros"/>
+        <w:numPr>
+          <w:ilvl w:val="0"/>
+          <w:numId w:val="0"/>
+        </w:numPr>
       </w:pPr>
       <w:r>
         <w:t>Define the objective.</w:t>
@@ -3480,6 +3478,10 @@
     <w:p>
       <w:pPr>
         <w:pStyle w:val="Listaconnmeros"/>
+        <w:numPr>
+          <w:ilvl w:val="0"/>
+          <w:numId w:val="10"/>
+        </w:numPr>
       </w:pPr>
       <w:r>
         <w:t>Check the repository state.</w:t>
@@ -4430,7 +4432,7 @@
       <w:rPr>
         <w:noProof/>
       </w:rPr>
-      <w:t>15</w:t>
+      <w:t>1</w:t>
     </w:r>
     <w:r>
       <w:fldChar w:fldCharType="end"/>
@@ -4619,7 +4621,7 @@
   <w:abstractNum w:abstractNumId="7" w15:restartNumberingAfterBreak="0">
     <w:nsid w:val="FFFFFF88"/>
     <w:multiLevelType w:val="singleLevel"/>
-    <w:tmpl w:val="D0A62B40"/>
+    <w:tmpl w:val="50728472"/>
     <w:lvl w:ilvl="0">
       <w:start w:val="1"/>
       <w:numFmt w:val="decimal"/>
@@ -4632,6 +4634,9 @@
         </w:tabs>
         <w:ind w:left="360" w:hanging="360"/>
       </w:pPr>
+      <w:rPr>
+        <w:rFonts w:hint="default"/>
+      </w:rPr>
     </w:lvl>
   </w:abstractNum>
   <w:abstractNum w:abstractNumId="8" w15:restartNumberingAfterBreak="0">
@@ -4681,6 +4686,12 @@
   </w:num>
   <w:num w:numId="9">
     <w:abstractNumId w:val="0"/>
+  </w:num>
+  <w:num w:numId="10">
+    <w:abstractNumId w:val="7"/>
+    <w:lvlOverride w:ilvl="0">
+      <w:startOverride w:val="1"/>
+    </w:lvlOverride>
   </w:num>
 </w:numbering>
 </file>
@@ -16086,6 +16097,36 @@
       <w:sz w:val="18"/>
     </w:rPr>
   </w:style>
+  <w:style w:type="paragraph" w:styleId="Textodeglobo">
+    <w:name w:val="Balloon Text"/>
+    <w:basedOn w:val="Normal"/>
+    <w:link w:val="TextodegloboCar"/>
+    <w:uiPriority w:val="99"/>
+    <w:semiHidden/>
+    <w:unhideWhenUsed/>
+    <w:rsid w:val="00E161B7"/>
+    <w:pPr>
+      <w:spacing w:after="0" w:line="240" w:lineRule="auto"/>
+    </w:pPr>
+    <w:rPr>
+      <w:rFonts w:ascii="Segoe UI" w:hAnsi="Segoe UI" w:cs="Segoe UI"/>
+      <w:sz w:val="18"/>
+      <w:szCs w:val="18"/>
+    </w:rPr>
+  </w:style>
+  <w:style w:type="character" w:customStyle="1" w:styleId="TextodegloboCar">
+    <w:name w:val="Texto de globo Car"/>
+    <w:basedOn w:val="Fuentedeprrafopredeter"/>
+    <w:link w:val="Textodeglobo"/>
+    <w:uiPriority w:val="99"/>
+    <w:semiHidden/>
+    <w:rsid w:val="00E161B7"/>
+    <w:rPr>
+      <w:rFonts w:ascii="Segoe UI" w:eastAsia="Aptos" w:hAnsi="Segoe UI" w:cs="Segoe UI"/>
+      <w:sz w:val="18"/>
+      <w:szCs w:val="18"/>
+    </w:rPr>
+  </w:style>
 </w:styles>
 </file>
 
@@ -16414,7 +16455,7 @@
 </file>
 
 <file path=customXml/itemProps1.xml><?xml version="1.0" encoding="utf-8"?>
-<ds:datastoreItem xmlns:ds="http://schemas.openxmlformats.org/officeDocument/2006/customXml" ds:itemID="{0D46FCD8-6B31-4494-83B2-F65E4F178361}">
+<ds:datastoreItem xmlns:ds="http://schemas.openxmlformats.org/officeDocument/2006/customXml" ds:itemID="{59656E49-4CA6-4849-A8BE-C04B07234DCC}">
   <ds:schemaRefs>
     <ds:schemaRef ds:uri="http://schemas.openxmlformats.org/officeDocument/2006/bibliography"/>
   </ds:schemaRefs>

</xml_diff>